<commit_message>
deploy: update validated Project Ascension preview
Source: bc2c6175a8af168e87523263c49d0411de511d82
Artifact: f67f2a73188e401d75e75d5f0acb3542e5d37eb2a525cbbeb44142ec343e623a
Built artifact: 86c099ef4ed7ac42288aa69e0e87b88e3d42161b26c1e77a94ce33e437545c2a
Deployed at: 2026-07-19T13:40:02Z
Routes: 18
Files: 70
Resume PDF: 216cdb762b3904179c6ba150771f12a42e5fcc9a58c7f6d939b839f778ed83f5
Resume DOCX: 10dee040f84ec5a0db21a5fbc4208ae80ea9d47c3778c6fcf4aec5dd8296ed43
Indexing: noindex,nofollow
Analytics: disabled
Canonical: https://jodouma.github.io/
</commit_message>
<xml_diff>
--- a/resumes/Youssef_Douma_Platform_DevOps_Resume.docx
+++ b/resumes/Youssef_Douma_Platform_DevOps_Resume.docx
@@ -82,7 +82,7 @@
         <w:spacing w:before="0" w:after="45" w:line="215" w:lineRule="auto"/>
       </w:pPr>
       <w:r>
-        <w:t xml:space="preserve">Available immediately for remote opportunities from Tunisia and open to international relocation with employer sponsorship or by agreement.</w:t>
+        <w:t xml:space="preserve">Open to remote opportunities from Tunisia and international relocation with employer sponsorship or by mutual agreement.</w:t>
       </w:r>
     </w:p>
     <w:bookmarkStart w:id="12" w:name="summary"/>
@@ -99,7 +99,7 @@
         <w:pStyle w:val="FirstParagraph"/>
       </w:pPr>
       <w:r>
-        <w:t xml:space="preserve">Platform and Infrastructure Engineer with 6+ years of hands-on experience across cloud infrastructure, DevOps, production reliability, Kubernetes, observability, automation and database operations. Nearly four years owning production infrastructure for a high-traffic international marketplace, with deep evidence across Linux/Nginx/Passenger, PostgreSQL, monitoring, Cloudflare/edge operations, incident escalation, safe change/rollback practice and infrastructure automation.</w:t>
+        <w:t xml:space="preserve">Platform and Infrastructure Engineer with 6+ years of hands-on experience across cloud infrastructure, DevOps, production reliability, Kubernetes, observability, automation and database operations. Nearly four years owning production infrastructure for an international marketplace, spanning Linux/Nginx/Passenger, PostgreSQL, Redis, monitoring, Cloudflare edge operations, incident escalation, controlled change, rollback planning and infrastructure automation.</w:t>
       </w:r>
     </w:p>
     <w:bookmarkEnd w:id="12"/>
@@ -142,6 +142,18 @@
         </w:numPr>
       </w:pPr>
       <w:r>
+        <w:t xml:space="preserve">Reviewed production changes, investigated incidents and coordinated validation, rollback and recovery across application and infrastructure stakeholders.</w:t>
+      </w:r>
+    </w:p>
+    <w:p>
+      <w:pPr>
+        <w:pStyle w:val="Compact"/>
+        <w:numPr>
+          <w:ilvl w:val="0"/>
+          <w:numId w:val="1001"/>
+        </w:numPr>
+      </w:pPr>
+      <w:r>
         <w:t xml:space="preserve">Contributed to PostgreSQL optimization that reduced storage from 199 GiB to 133 GiB, reclaiming 66 GiB (~33%).</w:t>
       </w:r>
     </w:p>
@@ -154,7 +166,31 @@
         </w:numPr>
       </w:pPr>
       <w:r>
-        <w:t xml:space="preserve">Validated five parallel Jitsi/Jibri recording workers with successful export and idempotent reruns.</w:t>
+        <w:t xml:space="preserve">Modernized a secure multidomain Jitsi/Jibri recording platform with strict JWT authentication, automated DNS-01 certificates, reversible proxy cutover and a validated multi-worker export path.</w:t>
+      </w:r>
+    </w:p>
+    <w:p>
+      <w:pPr>
+        <w:pStyle w:val="Compact"/>
+        <w:numPr>
+          <w:ilvl w:val="0"/>
+          <w:numId w:val="1001"/>
+        </w:numPr>
+      </w:pPr>
+      <w:r>
+        <w:t xml:space="preserve">Validated five parallel recording workers with successful exports and idempotent reruns.</w:t>
+      </w:r>
+    </w:p>
+    <w:p>
+      <w:pPr>
+        <w:pStyle w:val="Compact"/>
+        <w:numPr>
+          <w:ilvl w:val="0"/>
+          <w:numId w:val="1001"/>
+        </w:numPr>
+      </w:pPr>
+      <w:r>
+        <w:t xml:space="preserve">Implemented a controlled Cloudflare edge integration with full TLS, HTTPS enforcement, modern protocol support and conservative delivery settings while preserving rollback awareness.</w:t>
       </w:r>
     </w:p>
     <w:p>
@@ -224,7 +260,7 @@
         </w:numPr>
       </w:pPr>
       <w:r>
-        <w:t xml:space="preserve">Improved CI/CD and infrastructure observability using CloudWatch, Prometheus and Grafana.</w:t>
+        <w:t xml:space="preserve">Improved CI/CD and infrastructure observability using CloudWatch, Prometheus and Grafana while collaborating with product and engineering stakeholders.</w:t>
       </w:r>
     </w:p>
     <w:bookmarkEnd w:id="14"/>
@@ -246,7 +282,7 @@
         </w:numPr>
       </w:pPr>
       <w:r>
-        <w:t xml:space="preserve">Designed and deployed an AWS environment using Kubernetes and Amazon EKS.</w:t>
+        <w:t xml:space="preserve">Designed and deployed an AWS cloud platform using Amazon EKS, Kubernetes, Helm and containerized application services.</w:t>
       </w:r>
     </w:p>
     <w:p>
@@ -258,7 +294,7 @@
         </w:numPr>
       </w:pPr>
       <w:r>
-        <w:t xml:space="preserve">Built CI/CD workflows and centralized logging, monitoring and search using the Elastic Stack and Amazon OpenSearch.</w:t>
+        <w:t xml:space="preserve">Built Jenkins-based CI/CD workflows and centralized infrastructure/application telemetry with Elasticsearch, Kibana and Metricbeat.</w:t>
       </w:r>
     </w:p>
     <w:p>
@@ -270,15 +306,140 @@
         </w:numPr>
       </w:pPr>
       <w:r>
-        <w:t xml:space="preserve">Introduced auto-scaling, performance monitoring and anomaly-detection mechanisms for resilience and operational visibility.</w:t>
+        <w:t xml:space="preserve">Configured observability dashboards and unsupervised anomaly-detection jobs, then ran a controlled DDoS-style load test to validate detection and operational investigation.</w:t>
+      </w:r>
+    </w:p>
+    <w:p>
+      <w:pPr>
+        <w:pStyle w:val="Compact"/>
+        <w:numPr>
+          <w:ilvl w:val="0"/>
+          <w:numId w:val="1003"/>
+        </w:numPr>
+      </w:pPr>
+      <w:r>
+        <w:t xml:space="preserve">Exercised deployment validation, rollback and recovery procedures without claiming the anomaly model itself stopped traffic.</w:t>
       </w:r>
     </w:p>
     <w:bookmarkEnd w:id="15"/>
     <w:bookmarkEnd w:id="16"/>
-    <w:bookmarkStart w:id="17" w:name="leadership--teaching"/>
+    <w:bookmarkStart w:id="20" w:name="selected-platform-work"/>
     <w:p>
       <w:pPr>
         <w:pStyle w:val="Heading1"/>
+        <w:pageBreakBefore/>
+      </w:pPr>
+      <w:r>
+        <w:t xml:space="preserve">Selected Platform Work</w:t>
+      </w:r>
+    </w:p>
+    <w:bookmarkStart w:id="17" w:name="X41a9607ffde5ce3f2a56e516d0efbb9fb068771"/>
+    <w:p>
+      <w:pPr>
+        <w:pStyle w:val="Heading2"/>
+      </w:pPr>
+      <w:r>
+        <w:t xml:space="preserve">Production PostgreSQL Storage Optimization</w:t>
+      </w:r>
+    </w:p>
+    <w:p>
+      <w:pPr>
+        <w:pStyle w:val="Compact"/>
+        <w:numPr>
+          <w:ilvl w:val="0"/>
+          <w:numId w:val="1004"/>
+        </w:numPr>
+      </w:pPr>
+      <w:r>
+        <w:t xml:space="preserve">Investigated operational storage pressure, classified reclaimable data and planned an intervention around lock, availability, backup and recovery concerns.</w:t>
+      </w:r>
+    </w:p>
+    <w:p>
+      <w:pPr>
+        <w:pStyle w:val="Compact"/>
+        <w:numPr>
+          <w:ilvl w:val="0"/>
+          <w:numId w:val="1004"/>
+        </w:numPr>
+      </w:pPr>
+      <w:r>
+        <w:t xml:space="preserve">Verified a reduction from approximately 199 GiB to 133 GiB, reclaiming 66 GiB (approximately 33%), then monitored the post-change state without inferring unsupported performance or cost savings.</w:t>
+      </w:r>
+    </w:p>
+    <w:bookmarkEnd w:id="17"/>
+    <w:bookmarkStart w:id="18" w:name="secure-recording-platform-modernization"/>
+    <w:p>
+      <w:pPr>
+        <w:pStyle w:val="Heading2"/>
+      </w:pPr>
+      <w:r>
+        <w:t xml:space="preserve">Secure Recording Platform Modernization</w:t>
+      </w:r>
+    </w:p>
+    <w:p>
+      <w:pPr>
+        <w:pStyle w:val="Compact"/>
+        <w:numPr>
+          <w:ilvl w:val="0"/>
+          <w:numId w:val="1005"/>
+        </w:numPr>
+      </w:pPr>
+      <w:r>
+        <w:t xml:space="preserve">Coordinated strict JWT authentication, negative-path tests, multidomain DNS, DNS-01 certificate automation, Nginx/WebSocket cutover and Docker service rebinding.</w:t>
+      </w:r>
+    </w:p>
+    <w:p>
+      <w:pPr>
+        <w:pStyle w:val="Compact"/>
+        <w:numPr>
+          <w:ilvl w:val="0"/>
+          <w:numId w:val="1005"/>
+        </w:numPr>
+      </w:pPr>
+      <w:r>
+        <w:t xml:space="preserve">Prepared apply/rollback automation and validation procedures covering recording, export, reruns and failure investigation.</w:t>
+      </w:r>
+    </w:p>
+    <w:bookmarkEnd w:id="18"/>
+    <w:bookmarkStart w:id="19" w:name="applied-infrastructure-audit-pipeline"/>
+    <w:p>
+      <w:pPr>
+        <w:pStyle w:val="Heading2"/>
+      </w:pPr>
+      <w:r>
+        <w:t xml:space="preserve">Applied Infrastructure Audit Pipeline</w:t>
+      </w:r>
+    </w:p>
+    <w:p>
+      <w:pPr>
+        <w:pStyle w:val="Compact"/>
+        <w:numPr>
+          <w:ilvl w:val="0"/>
+          <w:numId w:val="1006"/>
+        </w:numPr>
+      </w:pPr>
+      <w:r>
+        <w:t xml:space="preserve">Built read-only collection controls, structured inventories, raw/sanitized output separation and multi-format safety scans for infrastructure review.</w:t>
+      </w:r>
+    </w:p>
+    <w:p>
+      <w:pPr>
+        <w:pStyle w:val="Compact"/>
+        <w:numPr>
+          <w:ilvl w:val="0"/>
+          <w:numId w:val="1006"/>
+        </w:numPr>
+      </w:pPr>
+      <w:r>
+        <w:t xml:space="preserve">Kept inaccessible systems explicitly unresolved rather than turning missing evidence into guessed state.</w:t>
+      </w:r>
+    </w:p>
+    <w:bookmarkEnd w:id="19"/>
+    <w:bookmarkEnd w:id="20"/>
+    <w:bookmarkStart w:id="21" w:name="leadership--teaching"/>
+    <w:p>
+      <w:pPr>
+        <w:pStyle w:val="Heading1"/>
       </w:pPr>
       <w:r>
         <w:t xml:space="preserve">Leadership &amp; Teaching</w:t>
@@ -289,15 +450,27 @@
         <w:pStyle w:val="Compact"/>
         <w:numPr>
           <w:ilvl w:val="0"/>
-          <w:numId w:val="1004"/>
-        </w:numPr>
-      </w:pPr>
-      <w:r>
-        <w:t xml:space="preserve">Technical Instructor at Leaders University Nabeul (2025–2026): delivered Virtualisation and Cloud instruction and designed applied AWS/Linux and Flask/PostgreSQL security labs.</w:t>
-      </w:r>
-    </w:p>
-    <w:bookmarkEnd w:id="17"/>
-    <w:bookmarkStart w:id="18" w:name="education"/>
+          <w:numId w:val="1007"/>
+        </w:numPr>
+      </w:pPr>
+      <w:r>
+        <w:t xml:space="preserve">Technical Instructor at Leaders University Nabeul (Oct 2024–2026): delivers Virtualisation and Cloud instruction and designs applied AWS/Linux and Flask/PostgreSQL security labs.</w:t>
+      </w:r>
+    </w:p>
+    <w:p>
+      <w:pPr>
+        <w:pStyle w:val="Compact"/>
+        <w:numPr>
+          <w:ilvl w:val="0"/>
+          <w:numId w:val="1007"/>
+        </w:numPr>
+      </w:pPr>
+      <w:r>
+        <w:t xml:space="preserve">Transfers production practices through repeatable environments, validation, teardown, authorized-use guidance and practical mentoring.</w:t>
+      </w:r>
+    </w:p>
+    <w:bookmarkEnd w:id="21"/>
+    <w:bookmarkStart w:id="22" w:name="education"/>
     <w:p>
       <w:pPr>
         <w:pStyle w:val="Heading1"/>
@@ -311,7 +484,7 @@
         <w:pStyle w:val="Compact"/>
         <w:numPr>
           <w:ilvl w:val="0"/>
-          <w:numId w:val="1005"/>
+          <w:numId w:val="1008"/>
         </w:numPr>
       </w:pPr>
       <w:r>
@@ -323,15 +496,15 @@
         <w:pStyle w:val="Compact"/>
         <w:numPr>
           <w:ilvl w:val="0"/>
-          <w:numId w:val="1005"/>
+          <w:numId w:val="1008"/>
         </w:numPr>
       </w:pPr>
       <w:r>
         <w:t xml:space="preserve">Applied Bachelor’s in Computing and Business Administration (Business Computing) — Bien, awarded Jul 2019</w:t>
       </w:r>
     </w:p>
-    <w:bookmarkEnd w:id="18"/>
-    <w:bookmarkStart w:id="19" w:name="technical-focus"/>
+    <w:bookmarkEnd w:id="22"/>
+    <w:bookmarkStart w:id="23" w:name="technical-focus"/>
     <w:p>
       <w:pPr>
         <w:pStyle w:val="Heading1"/>
@@ -345,10 +518,10 @@
         <w:pStyle w:val="FirstParagraph"/>
       </w:pPr>
       <w:r>
-        <w:t xml:space="preserve">Linux/Ubuntu · Nginx · Passenger · PostgreSQL · Redis · New Relic · Grafana · OpenSearch · Cloudflare · DNS/TLS · Docker · Jitsi/Jibri · AWS · EKS/Kubernetes · Jenkins · Elastic Stack · incident response · rollback/recovery · mentoring</w:t>
-      </w:r>
-    </w:p>
-    <w:bookmarkEnd w:id="19"/>
+        <w:t xml:space="preserve">Linux/Ubuntu · Nginx · Passenger · Ruby on Rails operations · PostgreSQL · Redis · New Relic · Grafana · Prometheus · OpenSearch · Elastic Stack · Cloudflare · DNS/TLS · Docker · Jitsi/Jibri · AWS · EKS/Kubernetes · Helm · Jenkins · CI/CD · incident response · rollback/recovery · mentoring</w:t>
+      </w:r>
+    </w:p>
+    <w:bookmarkEnd w:id="23"/>
     <w:sectPr>
       <w:footnotePr>
         <w:numRestart w:val="eachSect"/>
@@ -581,6 +754,15 @@
     <w:abstractNumId w:val="991"/>
   </w:num>
   <w:num w:numId="1005">
+    <w:abstractNumId w:val="991"/>
+  </w:num>
+  <w:num w:numId="1006">
+    <w:abstractNumId w:val="991"/>
+  </w:num>
+  <w:num w:numId="1007">
+    <w:abstractNumId w:val="991"/>
+  </w:num>
+  <w:num w:numId="1008">
     <w:abstractNumId w:val="991"/>
   </w:num>
 </w:numbering>

</xml_diff>